<commit_message>
Tambah jenjang (SD/SMP/SMA/SMK) pada template & bank soal + cache-busting v2 + file contoh soal baru
- template-soal.docx: baris JENJANG di bawah KODE SOAL (parser deteksi & sebarkan ke semua soal dalam paket)
- docx-parser.js: deteksi JENJANG -> s.jenjang
- schema.sql: kolom jenjang di soal_bank + RPC bank_soal/simpan_soal
- guru.html: badge jenjang, dropdown edit, filter & pencarian jenjang, payload upload
- seed.sql & mock api.js: jenjang di data demo
- admin/index/guru.html: cache-busting ?v=2 untuk css/js
- template: contoh soal TKA Bahasa Indonesia SD + template siswa diperbarui
</commit_message>
<xml_diff>
--- a/template/template-soal.docx
+++ b/template/template-soal.docx
@@ -10,6 +10,16 @@
           <w:sz w:val="26"/>
         </w:rPr>
         <w:t>KODE SOAL: M-2026-001</w:t>
+      </w:r>
+    </w:p>
+    <w:p>
+      <w:r>
+        <w:rPr>
+          <w:b/>
+          <w:color w:val="1D4ED8"/>
+          <w:sz w:val="26"/>
+        </w:rPr>
+        <w:t>JENJANG: SMA</w:t>
       </w:r>
     </w:p>
     <w:p>
@@ -247,7 +257,7 @@
         <w:rPr>
           <w:sz w:val="18"/>
         </w:rPr>
-        <w:t>Satu file Word = satu paket soal dengan satu kode soal di baris pertama. Semua soal dalam file ini akan mendapat kode yang sama saat di-upload ke aplikasi.</w:t>
+        <w:t>Satu file Word = satu paket soal dengan satu kode soal di baris pertama dan jenjang (SD/SMP/SMA/SMK) di baris berikutnya. Semua soal dalam file ini akan mendapat kode dan jenjang yang sama saat di-upload ke aplikasi.</w:t>
       </w:r>
     </w:p>
     <w:sectPr>

</xml_diff>

<commit_message>
Hapus field topik + form kode ujian di halaman guru; template & parser soal dukung MAPEL
</commit_message>
<xml_diff>
--- a/template/template-soal.docx
+++ b/template/template-soal.docx
@@ -20,6 +20,16 @@
           <w:sz w:val="26"/>
         </w:rPr>
         <w:t>JENJANG: SMA</w:t>
+      </w:r>
+    </w:p>
+    <w:p>
+      <w:r>
+        <w:rPr>
+          <w:b/>
+          <w:color w:val="1D4ED8"/>
+          <w:sz w:val="26"/>
+        </w:rPr>
+        <w:t>MAPEL: Matematika</w:t>
       </w:r>
     </w:p>
     <w:p>
@@ -257,7 +267,7 @@
         <w:rPr>
           <w:sz w:val="18"/>
         </w:rPr>
-        <w:t>Satu file Word = satu paket soal dengan satu kode soal di baris pertama dan jenjang (SD/SMP/SMA/SMK) di baris berikutnya. Semua soal dalam file ini akan mendapat kode dan jenjang yang sama saat di-upload ke aplikasi.</w:t>
+        <w:t>Satu file Word = satu paket soal dengan satu kode soal di baris pertama, jenjang (SD/SMP/SMA/SMK), dan mapel di baris berikutnya. Semua soal dalam file ini akan mendapat kode, jenjang, dan mapel yang sama saat di-upload ke aplikasi.</w:t>
       </w:r>
     </w:p>
     <w:sectPr>

</xml_diff>